<commit_message>
docs: cập nhật bảng RAM/ổ đĩa thực tế trong tài liệu kiến trúc
Co-Authored-By: Claude Opus 5.5 <noreply@anthropic.com>
Claude-Session: https://claude.ai/code/session_01UcguEZtPy4PiYnq4VMXiuc
</commit_message>
<xml_diff>
--- a/docs/kien-truc-gd1.docx
+++ b/docs/kien-truc-gd1.docx
@@ -184,7 +184,7 @@
         <w:t xml:space="preserve">192.168.100.0/24</w:t>
       </w:r>
       <w:r>
-        <w:t xml:space="preserve">, tổng khoảng 16–18 GB RAM. Máy yếu thì gộp Indexer và Dashboard vào một VM.</w:t>
+        <w:t xml:space="preserve">, tổng 12 GB RAM cho VM, vừa máy thật 16 GB; Kali chỉ bật khi tấn công. Card mạng ens32, DNS qua NAT 192.168.100.2.</w:t>
       </w:r>
     </w:p>
     <w:tbl>
@@ -399,7 +399,7 @@
           <w:p>
             <w:pPr/>
             <w:r>
-              <w:t xml:space="preserve">2–4 GB</w:t>
+              <w:t xml:space="preserve">3 GB</w:t>
             </w:r>
           </w:p>
         </w:tc>
@@ -467,7 +467,7 @@
           <w:p>
             <w:pPr/>
             <w:r>
-              <w:t xml:space="preserve">4 GB</w:t>
+              <w:t xml:space="preserve">2 GB</w:t>
             </w:r>
           </w:p>
         </w:tc>
@@ -535,7 +535,7 @@
           <w:p>
             <w:pPr/>
             <w:r>
-              <w:t xml:space="preserve">4 GB</w:t>
+              <w:t xml:space="preserve">3 GB</w:t>
             </w:r>
           </w:p>
         </w:tc>
@@ -603,7 +603,7 @@
           <w:p>
             <w:pPr/>
             <w:r>
-              <w:t xml:space="preserve">2–4 GB</w:t>
+              <w:t xml:space="preserve">2 GB</w:t>
             </w:r>
           </w:p>
         </w:tc>

</xml_diff>

<commit_message>
docs: update architecture doc to deployed state
Co-Authored-By: Claude Sonnet 5.5 <noreply@anthropic.com>
Claude-Session: https://claude.ai/code/session_01UcguEZtPy4PiYnq4VMXiuc
</commit_message>
<xml_diff>
--- a/docs/kien-truc-gd1.docx
+++ b/docs/kien-truc-gd1.docx
@@ -87,7 +87,7 @@
         <w:t xml:space="preserve">Trong phạm vi:</w:t>
       </w:r>
       <w:r>
-        <w:t xml:space="preserve"> WAF ModSecurity + DVWA, Wazuh 4.14 tách 3 VM (Server, Indexer, Dashboard), decoder/rule cho log WAF; thu thêm access log DVWA.</w:t>
+        <w:t xml:space="preserve"> WAF ModSecurity + DVWA, Wazuh 4.14.9 tách 3 VM (Server, Indexer, Dashboard), decoder/rule cho log WAF (khớp theo nội dung, vì Docker syslog không gửi hostname); thu thêm access log DVWA.</w:t>
       </w:r>
     </w:p>
     <w:p>
@@ -1897,7 +1897,7 @@
         </w:numPr>
       </w:pPr>
       <w:r>
-        <w:t xml:space="preserve">Dashboard hiển thị cảnh báo; nếu cùng IP sinh ≥10 cảnh báo trong 60 giây thì rule 100220 báo level 13.</w:t>
+        <w:t xml:space="preserve">Dashboard hiển thị cảnh báo; nếu cùng IP có ≥5 request bị chặn trong 60 giây thì rule 100220 báo level 13.</w:t>
       </w:r>
     </w:p>
     <w:p>

</xml_diff>